<commit_message>
Add character personality to 6 cases; author Boulderfield & The Weekly Rate
Gave each of this week's protagonists a distinct name and real
character texture (fixing a "three Priyas" template collision), added
visuals and glossary context to Fizzer Order per review feedback, and
authored two new reinforcement cases (Boulderfield, Pre-Algebra;
The Weekly Rate, Algebra) to round out the week's level mix after
swapping Fizzer Order and Kite Cut out of this week's release in favor
of Creek Span. All 8 cases re-verified through the full case-readiness
gate (Tier 1 + all 7 Tier 2 probes) after edits. Refreshed dashboard
and pipeline_status.json to register the 2 new cases and correct
stale stage/status data for all 8.

Co-Authored-By: Claude Sonnet 5 <noreply@anthropic.com>
</commit_message>
<xml_diff>
--- a/cases/creek-span/published/Creek Span - Case Study.docx
+++ b/cases/creek-span/published/Creek Span - Case Study.docx
@@ -43,7 +43,7 @@
     </w:p>
     <w:p>
       <w:r>
-        <w:t xml:space="preserve">Priya Nakamura has two truss elevations pinned to the light table and a shop that stops cutting steel at four o'clock.</w:t>
+        <w:t xml:space="preserve">Suri Nakamura has two truss elevations pinned to the light table and a shop that stops cutting steel at four o'clock.</w:t>
       </w:r>
     </w:p>
     <w:p>
@@ -53,7 +53,7 @@
     </w:p>
     <w:p>
       <w:r>
-        <w:t xml:space="preserve">Priya has been staring at that pallet since Tuesday. She can see, just by eye, that the pieces are short — shorter than she'd normally spec for a truss this size. Whether "short" means "won't reach" is a different question, and it's the one her supervisor just asked her, standing in her doorway with her coat already on.</w:t>
+        <w:t xml:space="preserve">Suri has been staring at that pallet since Tuesday. She can see, just by eye, that the pieces are short — shorter than she'd normally spec for a truss this size. Whether "short" means "won't reach" is a different question, and it's the one her supervisor just asked her, standing in her doorway with her coat already on.</w:t>
       </w:r>
     </w:p>
     <w:p>
@@ -63,7 +63,7 @@
     </w:p>
     <w:p>
       <w:r>
-        <w:t xml:space="preserve">Priya pulls the tape measure off her desk and looks at the two elevations again.</w:t>
+        <w:t xml:space="preserve">Suri pulls the tape measure off her desk and looks at the two elevations again.</w:t>
       </w:r>
     </w:p>
     <w:p>
@@ -77,7 +77,7 @@
     </w:p>
     <w:p>
       <w:r>
-        <w:t xml:space="preserve">Priya Nakamura is a staff structural engineer at Ferrand &amp; Cole Structural, a small civil engineering firm under contract to the Kestrel County Parks Department. Her job is to finalize the shop drawing for a replacement pedestrian truss bridge over Miller's Creek, on a heavily used rail-trail — a drawing the fabricator's shop will cut steel from directly, so every member length on it has to be a real, buildable length, not just a number that looks right on the elevation.</w:t>
+        <w:t xml:space="preserve">Suri Nakamura is a staff structural engineer at Ferrand &amp; Cole Structural, a small civil engineering firm under contract to the Kestrel County Parks Department. She grew up in this town, close enough to Miller's Creek that she crossed the old plank footbridge every school morning as a kid, so the crossing she's now been asked to redesign is not just another job site to her — a fact she keeps carefully separate from the engineering. She still carries a tape measure in her bag out of old habit, pulling it out even in meetings where she'll never actually use it. Her job here is to finalize the shop drawing for a replacement pedestrian truss bridge over Miller's Creek, on a heavily used rail-trail — a drawing the fabricator's shop will cut steel from directly, so every member length on it has to be a real, buildable length, not just a number that looks right on the elevation.</w:t>
       </w:r>
     </w:p>
     <w:p>
@@ -170,7 +170,7 @@
     </w:p>
     <w:p>
       <w:r>
-        <w:t xml:space="preserve">You are Priya Nakamura. Do you: A.) Detail The Warren Line — three 8-foot equilateral-triangle panels, every diagonal cut from new steel OR B.) Detail The Low Line — four shallower 6-foot panels built from the county's salvaged 3.5-foot diagonals, with heavier chord steel</w:t>
+        <w:t xml:space="preserve">You are Suri Nakamura. Do you: A.) Detail The Warren Line — three 8-foot equilateral-triangle panels, every diagonal cut from new steel OR B.) Detail The Low Line — four shallower 6-foot panels built from the county's salvaged 3.5-foot diagonals, with heavier chord steel</w:t>
       </w:r>
     </w:p>
     <w:p>
@@ -406,7 +406,7 @@
     </w:p>
     <w:p>
       <w:r>
-        <w:t xml:space="preserve">Priya's own layout for this crossing — not a public bridge plan (Ferrand &amp; Cole's project drawings are proprietary), but built entirely from real, standard Warren-truss geometry and the county's own floodway clearance requirement.</w:t>
+        <w:t xml:space="preserve">Suri's own layout for this crossing — not a public bridge plan (Ferrand &amp; Cole's project drawings are proprietary), but built entirely from real, standard Warren-truss geometry and the county's own floodway clearance requirement.</w:t>
       </w:r>
     </w:p>
     <w:tbl>
@@ -1815,7 +1815,7 @@
             <w:r>
               <w:t xml:space="preserve">Engineers Edge, "AISC Structural Steel Angle Sizes Table Chart A36" (</w:t>
             </w:r>
-            <w:hyperlink w:history="1" r:id="rIdonxhahenyi3-j0q8ij5bt">
+            <w:hyperlink w:history="1" r:id="rIdmfmuf_rxudoawe94odobu">
               <w:r>
                 <w:rPr>
                   <w:rStyle w:val="Hyperlink"/>
@@ -1888,7 +1888,7 @@
             <w:r>
               <w:t xml:space="preserve">Engineers Edge, "AISC Structural Steel Angle Sizes Table Chart A36" (</w:t>
             </w:r>
-            <w:hyperlink w:history="1" r:id="rIdlxlhndk1ixpwiaccccs7v">
+            <w:hyperlink w:history="1" r:id="rId-y89dse2owc3sbht69zkc">
               <w:r>
                 <w:rPr>
                   <w:rStyle w:val="Hyperlink"/>
@@ -1961,7 +1961,7 @@
             <w:r>
               <w:t xml:space="preserve">Engineers Edge, "AISC Structural Steel Angle Sizes Table Chart A36" (</w:t>
             </w:r>
-            <w:hyperlink w:history="1" r:id="rIdqbzzeukntjw9nyatlabhu">
+            <w:hyperlink w:history="1" r:id="rIdaqc6d0c03tjo8st39ajh1">
               <w:r>
                 <w:rPr>
                   <w:rStyle w:val="Hyperlink"/>
@@ -2034,7 +2034,7 @@
             <w:r>
               <w:t xml:space="preserve">SteelFlo, "Structural Steel Price Per Ton (2026 Update)" (</w:t>
             </w:r>
-            <w:hyperlink w:history="1" r:id="rIdf4qz2lj__vb8rqsy578bv">
+            <w:hyperlink w:history="1" r:id="rIdjkhibu2kvt342mscemxdo">
               <w:r>
                 <w:rPr>
                   <w:rStyle w:val="Hyperlink"/>
@@ -2107,7 +2107,7 @@
             <w:r>
               <w:t xml:space="preserve">U.S. Bureau of Labor Statistics, Occupational Outlook Handbook, "Structural Iron and Steel Workers" (</w:t>
             </w:r>
-            <w:hyperlink w:history="1" r:id="rIdaqomrfmknne8nldolepnr">
+            <w:hyperlink w:history="1" r:id="rIddpmrctkk4aoqg2bq12npa">
               <w:r>
                 <w:rPr>
                   <w:rStyle w:val="Hyperlink"/>
@@ -2164,7 +2164,7 @@
       <w:r>
         <w:t xml:space="preserve">- </w:t>
       </w:r>
-      <w:hyperlink w:history="1" r:id="rIdczjub2kvvw9crcs39vmjg">
+      <w:hyperlink w:history="1" r:id="rId2-ogb5zptwmk7os6zho_y">
         <w:r>
           <w:rPr>
             <w:rStyle w:val="Hyperlink"/>
@@ -2183,7 +2183,7 @@
       <w:r>
         <w:t xml:space="preserve">- </w:t>
       </w:r>
-      <w:hyperlink w:history="1" r:id="rIduouurbc2k2huemf8lksco">
+      <w:hyperlink w:history="1" r:id="rIdt8z5ov51tcpkkaskgutbu">
         <w:r>
           <w:rPr>
             <w:rStyle w:val="Hyperlink"/>
@@ -2202,7 +2202,7 @@
       <w:r>
         <w:t xml:space="preserve">- </w:t>
       </w:r>
-      <w:hyperlink w:history="1" r:id="rIdssgsspbahciwss7wjqkho">
+      <w:hyperlink w:history="1" r:id="rIdkkj8v0dmuo4fk3o-bbn1b">
         <w:r>
           <w:rPr>
             <w:rStyle w:val="Hyperlink"/>
@@ -2221,7 +2221,7 @@
       <w:r>
         <w:t xml:space="preserve">- </w:t>
       </w:r>
-      <w:hyperlink w:history="1" r:id="rIdymbggki0vqkjtbxbcb8cv">
+      <w:hyperlink w:history="1" r:id="rIdqfds5zpxw7riflnnwr0lx">
         <w:r>
           <w:rPr>
             <w:rStyle w:val="Hyperlink"/>
@@ -2240,7 +2240,7 @@
       <w:r>
         <w:t xml:space="preserve">- </w:t>
       </w:r>
-      <w:hyperlink w:history="1" r:id="rIdfzyrwfbldwd7fxi0eq0qk">
+      <w:hyperlink w:history="1" r:id="rId5myb99srklzyzytytavk0">
         <w:r>
           <w:rPr>
             <w:rStyle w:val="Hyperlink"/>

</xml_diff>